<commit_message>
docs: integration des captures d'ecran dans les documents
</commit_message>
<xml_diff>
--- a/docs/2_Manuel_Utilisateur.docx
+++ b/docs/2_Manuel_Utilisateur.docx
@@ -4802,6 +4802,352 @@
         <w:t>Suppression du Compte : Action irreversible necessitant la saisie du mot de passe actuel pour confirmation.</w:t>
       </w:r>
     </w:p>
+    <w:p>
+      <w:pPr>
+        <w:pStyle w:val="Heading1"/>
+      </w:pPr>
+      <w:r>
+        <w:t>Captures d'Ecran (Manuel Utilisateur)</w:t>
+      </w:r>
+    </w:p>
+    <w:p>
+      <w:r>
+        <w:t>Les images ci-dessous presentent l'interface reelle de l'application.</w:t>
+      </w:r>
+    </w:p>
+    <w:p>
+      <w:r>
+        <w:drawing>
+          <wp:inline xmlns:a="http://schemas.openxmlformats.org/drawingml/2006/main" xmlns:pic="http://schemas.openxmlformats.org/drawingml/2006/picture">
+            <wp:extent cx="5486400" cy="7315200"/>
+            <wp:docPr id="1" name="Picture 1"/>
+            <wp:cNvGraphicFramePr>
+              <a:graphicFrameLocks noChangeAspect="1"/>
+            </wp:cNvGraphicFramePr>
+            <a:graphic>
+              <a:graphicData uri="http://schemas.openxmlformats.org/drawingml/2006/picture">
+                <pic:pic>
+                  <pic:nvPicPr>
+                    <pic:cNvPr id="0" name="WhatsApp Image 2026-05-29 at 14.04.56.jpeg"/>
+                    <pic:cNvPicPr/>
+                  </pic:nvPicPr>
+                  <pic:blipFill>
+                    <a:blip r:embed="rId9"/>
+                    <a:stretch>
+                      <a:fillRect/>
+                    </a:stretch>
+                  </pic:blipFill>
+                  <pic:spPr>
+                    <a:xfrm>
+                      <a:off x="0" y="0"/>
+                      <a:ext cx="5486400" cy="7315200"/>
+                    </a:xfrm>
+                    <a:prstGeom prst="rect"/>
+                  </pic:spPr>
+                </pic:pic>
+              </a:graphicData>
+            </a:graphic>
+          </wp:inline>
+        </w:drawing>
+      </w:r>
+    </w:p>
+    <w:p/>
+    <w:p>
+      <w:r>
+        <w:drawing>
+          <wp:inline xmlns:a="http://schemas.openxmlformats.org/drawingml/2006/main" xmlns:pic="http://schemas.openxmlformats.org/drawingml/2006/picture">
+            <wp:extent cx="5486400" cy="7315200"/>
+            <wp:docPr id="2" name="Picture 2"/>
+            <wp:cNvGraphicFramePr>
+              <a:graphicFrameLocks noChangeAspect="1"/>
+            </wp:cNvGraphicFramePr>
+            <a:graphic>
+              <a:graphicData uri="http://schemas.openxmlformats.org/drawingml/2006/picture">
+                <pic:pic>
+                  <pic:nvPicPr>
+                    <pic:cNvPr id="0" name="WhatsApp Image 2026-05-29 at 14.04.57 (1).jpeg"/>
+                    <pic:cNvPicPr/>
+                  </pic:nvPicPr>
+                  <pic:blipFill>
+                    <a:blip r:embed="rId10"/>
+                    <a:stretch>
+                      <a:fillRect/>
+                    </a:stretch>
+                  </pic:blipFill>
+                  <pic:spPr>
+                    <a:xfrm>
+                      <a:off x="0" y="0"/>
+                      <a:ext cx="5486400" cy="7315200"/>
+                    </a:xfrm>
+                    <a:prstGeom prst="rect"/>
+                  </pic:spPr>
+                </pic:pic>
+              </a:graphicData>
+            </a:graphic>
+          </wp:inline>
+        </w:drawing>
+      </w:r>
+    </w:p>
+    <w:p/>
+    <w:p>
+      <w:r>
+        <w:drawing>
+          <wp:inline xmlns:a="http://schemas.openxmlformats.org/drawingml/2006/main" xmlns:pic="http://schemas.openxmlformats.org/drawingml/2006/picture">
+            <wp:extent cx="5486400" cy="7315200"/>
+            <wp:docPr id="3" name="Picture 3"/>
+            <wp:cNvGraphicFramePr>
+              <a:graphicFrameLocks noChangeAspect="1"/>
+            </wp:cNvGraphicFramePr>
+            <a:graphic>
+              <a:graphicData uri="http://schemas.openxmlformats.org/drawingml/2006/picture">
+                <pic:pic>
+                  <pic:nvPicPr>
+                    <pic:cNvPr id="0" name="WhatsApp Image 2026-05-29 at 14.04.57 (2).jpeg"/>
+                    <pic:cNvPicPr/>
+                  </pic:nvPicPr>
+                  <pic:blipFill>
+                    <a:blip r:embed="rId11"/>
+                    <a:stretch>
+                      <a:fillRect/>
+                    </a:stretch>
+                  </pic:blipFill>
+                  <pic:spPr>
+                    <a:xfrm>
+                      <a:off x="0" y="0"/>
+                      <a:ext cx="5486400" cy="7315200"/>
+                    </a:xfrm>
+                    <a:prstGeom prst="rect"/>
+                  </pic:spPr>
+                </pic:pic>
+              </a:graphicData>
+            </a:graphic>
+          </wp:inline>
+        </w:drawing>
+      </w:r>
+    </w:p>
+    <w:p/>
+    <w:p>
+      <w:r>
+        <w:drawing>
+          <wp:inline xmlns:a="http://schemas.openxmlformats.org/drawingml/2006/main" xmlns:pic="http://schemas.openxmlformats.org/drawingml/2006/picture">
+            <wp:extent cx="5486400" cy="7315200"/>
+            <wp:docPr id="4" name="Picture 4"/>
+            <wp:cNvGraphicFramePr>
+              <a:graphicFrameLocks noChangeAspect="1"/>
+            </wp:cNvGraphicFramePr>
+            <a:graphic>
+              <a:graphicData uri="http://schemas.openxmlformats.org/drawingml/2006/picture">
+                <pic:pic>
+                  <pic:nvPicPr>
+                    <pic:cNvPr id="0" name="WhatsApp Image 2026-05-29 at 14.04.57 (3).jpeg"/>
+                    <pic:cNvPicPr/>
+                  </pic:nvPicPr>
+                  <pic:blipFill>
+                    <a:blip r:embed="rId12"/>
+                    <a:stretch>
+                      <a:fillRect/>
+                    </a:stretch>
+                  </pic:blipFill>
+                  <pic:spPr>
+                    <a:xfrm>
+                      <a:off x="0" y="0"/>
+                      <a:ext cx="5486400" cy="7315200"/>
+                    </a:xfrm>
+                    <a:prstGeom prst="rect"/>
+                  </pic:spPr>
+                </pic:pic>
+              </a:graphicData>
+            </a:graphic>
+          </wp:inline>
+        </w:drawing>
+      </w:r>
+    </w:p>
+    <w:p/>
+    <w:p>
+      <w:r>
+        <w:drawing>
+          <wp:inline xmlns:a="http://schemas.openxmlformats.org/drawingml/2006/main" xmlns:pic="http://schemas.openxmlformats.org/drawingml/2006/picture">
+            <wp:extent cx="5486400" cy="7315200"/>
+            <wp:docPr id="5" name="Picture 5"/>
+            <wp:cNvGraphicFramePr>
+              <a:graphicFrameLocks noChangeAspect="1"/>
+            </wp:cNvGraphicFramePr>
+            <a:graphic>
+              <a:graphicData uri="http://schemas.openxmlformats.org/drawingml/2006/picture">
+                <pic:pic>
+                  <pic:nvPicPr>
+                    <pic:cNvPr id="0" name="WhatsApp Image 2026-05-29 at 14.04.57 (4).jpeg"/>
+                    <pic:cNvPicPr/>
+                  </pic:nvPicPr>
+                  <pic:blipFill>
+                    <a:blip r:embed="rId13"/>
+                    <a:stretch>
+                      <a:fillRect/>
+                    </a:stretch>
+                  </pic:blipFill>
+                  <pic:spPr>
+                    <a:xfrm>
+                      <a:off x="0" y="0"/>
+                      <a:ext cx="5486400" cy="7315200"/>
+                    </a:xfrm>
+                    <a:prstGeom prst="rect"/>
+                  </pic:spPr>
+                </pic:pic>
+              </a:graphicData>
+            </a:graphic>
+          </wp:inline>
+        </w:drawing>
+      </w:r>
+    </w:p>
+    <w:p/>
+    <w:p>
+      <w:r>
+        <w:drawing>
+          <wp:inline xmlns:a="http://schemas.openxmlformats.org/drawingml/2006/main" xmlns:pic="http://schemas.openxmlformats.org/drawingml/2006/picture">
+            <wp:extent cx="5486400" cy="7315200"/>
+            <wp:docPr id="6" name="Picture 6"/>
+            <wp:cNvGraphicFramePr>
+              <a:graphicFrameLocks noChangeAspect="1"/>
+            </wp:cNvGraphicFramePr>
+            <a:graphic>
+              <a:graphicData uri="http://schemas.openxmlformats.org/drawingml/2006/picture">
+                <pic:pic>
+                  <pic:nvPicPr>
+                    <pic:cNvPr id="0" name="WhatsApp Image 2026-05-29 at 14.04.57.jpeg"/>
+                    <pic:cNvPicPr/>
+                  </pic:nvPicPr>
+                  <pic:blipFill>
+                    <a:blip r:embed="rId14"/>
+                    <a:stretch>
+                      <a:fillRect/>
+                    </a:stretch>
+                  </pic:blipFill>
+                  <pic:spPr>
+                    <a:xfrm>
+                      <a:off x="0" y="0"/>
+                      <a:ext cx="5486400" cy="7315200"/>
+                    </a:xfrm>
+                    <a:prstGeom prst="rect"/>
+                  </pic:spPr>
+                </pic:pic>
+              </a:graphicData>
+            </a:graphic>
+          </wp:inline>
+        </w:drawing>
+      </w:r>
+    </w:p>
+    <w:p/>
+    <w:p>
+      <w:r>
+        <w:drawing>
+          <wp:inline xmlns:a="http://schemas.openxmlformats.org/drawingml/2006/main" xmlns:pic="http://schemas.openxmlformats.org/drawingml/2006/picture">
+            <wp:extent cx="5486400" cy="7315200"/>
+            <wp:docPr id="7" name="Picture 7"/>
+            <wp:cNvGraphicFramePr>
+              <a:graphicFrameLocks noChangeAspect="1"/>
+            </wp:cNvGraphicFramePr>
+            <a:graphic>
+              <a:graphicData uri="http://schemas.openxmlformats.org/drawingml/2006/picture">
+                <pic:pic>
+                  <pic:nvPicPr>
+                    <pic:cNvPr id="0" name="WhatsApp Image 2026-05-29 at 14.04.58 (1).jpeg"/>
+                    <pic:cNvPicPr/>
+                  </pic:nvPicPr>
+                  <pic:blipFill>
+                    <a:blip r:embed="rId15"/>
+                    <a:stretch>
+                      <a:fillRect/>
+                    </a:stretch>
+                  </pic:blipFill>
+                  <pic:spPr>
+                    <a:xfrm>
+                      <a:off x="0" y="0"/>
+                      <a:ext cx="5486400" cy="7315200"/>
+                    </a:xfrm>
+                    <a:prstGeom prst="rect"/>
+                  </pic:spPr>
+                </pic:pic>
+              </a:graphicData>
+            </a:graphic>
+          </wp:inline>
+        </w:drawing>
+      </w:r>
+    </w:p>
+    <w:p/>
+    <w:p>
+      <w:r>
+        <w:drawing>
+          <wp:inline xmlns:a="http://schemas.openxmlformats.org/drawingml/2006/main" xmlns:pic="http://schemas.openxmlformats.org/drawingml/2006/picture">
+            <wp:extent cx="5486400" cy="7315200"/>
+            <wp:docPr id="8" name="Picture 8"/>
+            <wp:cNvGraphicFramePr>
+              <a:graphicFrameLocks noChangeAspect="1"/>
+            </wp:cNvGraphicFramePr>
+            <a:graphic>
+              <a:graphicData uri="http://schemas.openxmlformats.org/drawingml/2006/picture">
+                <pic:pic>
+                  <pic:nvPicPr>
+                    <pic:cNvPr id="0" name="WhatsApp Image 2026-05-29 at 14.04.58 (2).jpeg"/>
+                    <pic:cNvPicPr/>
+                  </pic:nvPicPr>
+                  <pic:blipFill>
+                    <a:blip r:embed="rId16"/>
+                    <a:stretch>
+                      <a:fillRect/>
+                    </a:stretch>
+                  </pic:blipFill>
+                  <pic:spPr>
+                    <a:xfrm>
+                      <a:off x="0" y="0"/>
+                      <a:ext cx="5486400" cy="7315200"/>
+                    </a:xfrm>
+                    <a:prstGeom prst="rect"/>
+                  </pic:spPr>
+                </pic:pic>
+              </a:graphicData>
+            </a:graphic>
+          </wp:inline>
+        </w:drawing>
+      </w:r>
+    </w:p>
+    <w:p/>
+    <w:p>
+      <w:r>
+        <w:drawing>
+          <wp:inline xmlns:a="http://schemas.openxmlformats.org/drawingml/2006/main" xmlns:pic="http://schemas.openxmlformats.org/drawingml/2006/picture">
+            <wp:extent cx="5486400" cy="7315200"/>
+            <wp:docPr id="9" name="Picture 9"/>
+            <wp:cNvGraphicFramePr>
+              <a:graphicFrameLocks noChangeAspect="1"/>
+            </wp:cNvGraphicFramePr>
+            <a:graphic>
+              <a:graphicData uri="http://schemas.openxmlformats.org/drawingml/2006/picture">
+                <pic:pic>
+                  <pic:nvPicPr>
+                    <pic:cNvPr id="0" name="WhatsApp Image 2026-05-29 at 14.04.58.jpeg"/>
+                    <pic:cNvPicPr/>
+                  </pic:nvPicPr>
+                  <pic:blipFill>
+                    <a:blip r:embed="rId17"/>
+                    <a:stretch>
+                      <a:fillRect/>
+                    </a:stretch>
+                  </pic:blipFill>
+                  <pic:spPr>
+                    <a:xfrm>
+                      <a:off x="0" y="0"/>
+                      <a:ext cx="5486400" cy="7315200"/>
+                    </a:xfrm>
+                    <a:prstGeom prst="rect"/>
+                  </pic:spPr>
+                </pic:pic>
+              </a:graphicData>
+            </a:graphic>
+          </wp:inline>
+        </w:drawing>
+      </w:r>
+    </w:p>
+    <w:p/>
     <w:sectPr>
       <w:pgSz w:w="12240" w:h="15840"/>
       <w:pgMar w:top="1440" w:right="1800" w:bottom="1440" w:left="1800" w:header="720" w:footer="720" w:gutter="0"/>

</xml_diff>

<commit_message>
docs: attribution de chaque capture d'ecran a sa fonctionnalite precise dans le manuel et la maquette
</commit_message>
<xml_diff>
--- a/docs/2_Manuel_Utilisateur.docx
+++ b/docs/2_Manuel_Utilisateur.docx
@@ -340,6 +340,42 @@
     <w:p>
       <w:r>
         <w:t>En cas d'erreur de saisie, un message d'erreur en rouge apparait sous le champ concerne.</w:t>
+      </w:r>
+    </w:p>
+    <w:p>
+      <w:r>
+        <w:drawing>
+          <wp:inline xmlns:a="http://schemas.openxmlformats.org/drawingml/2006/main" xmlns:pic="http://schemas.openxmlformats.org/drawingml/2006/picture">
+            <wp:extent cx="5486400" cy="2738446"/>
+            <wp:docPr id="1" name="Picture 1"/>
+            <wp:cNvGraphicFramePr>
+              <a:graphicFrameLocks noChangeAspect="1"/>
+            </wp:cNvGraphicFramePr>
+            <a:graphic>
+              <a:graphicData uri="http://schemas.openxmlformats.org/drawingml/2006/picture">
+                <pic:pic>
+                  <pic:nvPicPr>
+                    <pic:cNvPr id="0" name="2_login.jpeg"/>
+                    <pic:cNvPicPr/>
+                  </pic:nvPicPr>
+                  <pic:blipFill>
+                    <a:blip r:embed="rId9"/>
+                    <a:stretch>
+                      <a:fillRect/>
+                    </a:stretch>
+                  </pic:blipFill>
+                  <pic:spPr>
+                    <a:xfrm>
+                      <a:off x="0" y="0"/>
+                      <a:ext cx="5486400" cy="2738446"/>
+                    </a:xfrm>
+                    <a:prstGeom prst="rect"/>
+                  </pic:spPr>
+                </pic:pic>
+              </a:graphicData>
+            </a:graphic>
+          </wp:inline>
+        </w:drawing>
       </w:r>
     </w:p>
     <w:p>
@@ -1008,6 +1044,42 @@
       </w:r>
     </w:p>
     <w:p>
+      <w:r>
+        <w:drawing>
+          <wp:inline xmlns:a="http://schemas.openxmlformats.org/drawingml/2006/main" xmlns:pic="http://schemas.openxmlformats.org/drawingml/2006/picture">
+            <wp:extent cx="5486400" cy="11711293"/>
+            <wp:docPr id="2" name="Picture 2"/>
+            <wp:cNvGraphicFramePr>
+              <a:graphicFrameLocks noChangeAspect="1"/>
+            </wp:cNvGraphicFramePr>
+            <a:graphic>
+              <a:graphicData uri="http://schemas.openxmlformats.org/drawingml/2006/picture">
+                <pic:pic>
+                  <pic:nvPicPr>
+                    <pic:cNvPr id="0" name="4_dashboard_principal.jpeg"/>
+                    <pic:cNvPicPr/>
+                  </pic:nvPicPr>
+                  <pic:blipFill>
+                    <a:blip r:embed="rId10"/>
+                    <a:stretch>
+                      <a:fillRect/>
+                    </a:stretch>
+                  </pic:blipFill>
+                  <pic:spPr>
+                    <a:xfrm>
+                      <a:off x="0" y="0"/>
+                      <a:ext cx="5486400" cy="11711293"/>
+                    </a:xfrm>
+                    <a:prstGeom prst="rect"/>
+                  </pic:spPr>
+                </pic:pic>
+              </a:graphicData>
+            </a:graphic>
+          </wp:inline>
+        </w:drawing>
+      </w:r>
+    </w:p>
+    <w:p>
       <w:pPr>
         <w:pStyle w:val="Heading2"/>
       </w:pPr>
@@ -1362,6 +1434,42 @@
       </w:pPr>
       <w:r>
         <w:t>Terminee (badge vert) : Tous les matchs ont ete joues. L'edition est archivee.</w:t>
+      </w:r>
+    </w:p>
+    <w:p>
+      <w:r>
+        <w:drawing>
+          <wp:inline xmlns:a="http://schemas.openxmlformats.org/drawingml/2006/main" xmlns:pic="http://schemas.openxmlformats.org/drawingml/2006/picture">
+            <wp:extent cx="5486400" cy="2738446"/>
+            <wp:docPr id="3" name="Picture 3"/>
+            <wp:cNvGraphicFramePr>
+              <a:graphicFrameLocks noChangeAspect="1"/>
+            </wp:cNvGraphicFramePr>
+            <a:graphic>
+              <a:graphicData uri="http://schemas.openxmlformats.org/drawingml/2006/picture">
+                <pic:pic>
+                  <pic:nvPicPr>
+                    <pic:cNvPr id="0" name="3_selection_edition.jpeg"/>
+                    <pic:cNvPicPr/>
+                  </pic:nvPicPr>
+                  <pic:blipFill>
+                    <a:blip r:embed="rId11"/>
+                    <a:stretch>
+                      <a:fillRect/>
+                    </a:stretch>
+                  </pic:blipFill>
+                  <pic:spPr>
+                    <a:xfrm>
+                      <a:off x="0" y="0"/>
+                      <a:ext cx="5486400" cy="2738446"/>
+                    </a:xfrm>
+                    <a:prstGeom prst="rect"/>
+                  </pic:spPr>
+                </pic:pic>
+              </a:graphicData>
+            </a:graphic>
+          </wp:inline>
+        </w:drawing>
       </w:r>
     </w:p>
     <w:p>
@@ -1902,6 +2010,42 @@
       </w:r>
     </w:p>
     <w:p>
+      <w:r>
+        <w:drawing>
+          <wp:inline xmlns:a="http://schemas.openxmlformats.org/drawingml/2006/main" xmlns:pic="http://schemas.openxmlformats.org/drawingml/2006/picture">
+            <wp:extent cx="5486400" cy="3166328"/>
+            <wp:docPr id="4" name="Picture 4"/>
+            <wp:cNvGraphicFramePr>
+              <a:graphicFrameLocks noChangeAspect="1"/>
+            </wp:cNvGraphicFramePr>
+            <a:graphic>
+              <a:graphicData uri="http://schemas.openxmlformats.org/drawingml/2006/picture">
+                <pic:pic>
+                  <pic:nvPicPr>
+                    <pic:cNvPr id="0" name="5_liste_facultes.jpeg"/>
+                    <pic:cNvPicPr/>
+                  </pic:nvPicPr>
+                  <pic:blipFill>
+                    <a:blip r:embed="rId12"/>
+                    <a:stretch>
+                      <a:fillRect/>
+                    </a:stretch>
+                  </pic:blipFill>
+                  <pic:spPr>
+                    <a:xfrm>
+                      <a:off x="0" y="0"/>
+                      <a:ext cx="5486400" cy="3166328"/>
+                    </a:xfrm>
+                    <a:prstGeom prst="rect"/>
+                  </pic:spPr>
+                </pic:pic>
+              </a:graphicData>
+            </a:graphic>
+          </wp:inline>
+        </w:drawing>
+      </w:r>
+    </w:p>
+    <w:p>
       <w:pPr>
         <w:pStyle w:val="Heading2"/>
       </w:pPr>
@@ -2186,6 +2330,42 @@
     </w:tbl>
     <w:p/>
     <w:p>
+      <w:r>
+        <w:drawing>
+          <wp:inline xmlns:a="http://schemas.openxmlformats.org/drawingml/2006/main" xmlns:pic="http://schemas.openxmlformats.org/drawingml/2006/picture">
+            <wp:extent cx="5486400" cy="2738446"/>
+            <wp:docPr id="5" name="Picture 5"/>
+            <wp:cNvGraphicFramePr>
+              <a:graphicFrameLocks noChangeAspect="1"/>
+            </wp:cNvGraphicFramePr>
+            <a:graphic>
+              <a:graphicData uri="http://schemas.openxmlformats.org/drawingml/2006/picture">
+                <pic:pic>
+                  <pic:nvPicPr>
+                    <pic:cNvPr id="0" name="6_ajouter_faculte.jpeg"/>
+                    <pic:cNvPicPr/>
+                  </pic:nvPicPr>
+                  <pic:blipFill>
+                    <a:blip r:embed="rId13"/>
+                    <a:stretch>
+                      <a:fillRect/>
+                    </a:stretch>
+                  </pic:blipFill>
+                  <pic:spPr>
+                    <a:xfrm>
+                      <a:off x="0" y="0"/>
+                      <a:ext cx="5486400" cy="2738446"/>
+                    </a:xfrm>
+                    <a:prstGeom prst="rect"/>
+                  </pic:spPr>
+                </pic:pic>
+              </a:graphicData>
+            </a:graphic>
+          </wp:inline>
+        </w:drawing>
+      </w:r>
+    </w:p>
+    <w:p>
       <w:pPr>
         <w:pStyle w:val="Heading2"/>
       </w:pPr>
@@ -2196,6 +2376,42 @@
     <w:p>
       <w:r>
         <w:t>La page de detail affiche les informations de la faculte ainsi que la liste de toutes ses equipes inscrites, avec pour chaque equipe : la discipline, le nombre de joueurs et un lien vers la fiche de l'equipe.</w:t>
+      </w:r>
+    </w:p>
+    <w:p>
+      <w:r>
+        <w:drawing>
+          <wp:inline xmlns:a="http://schemas.openxmlformats.org/drawingml/2006/main" xmlns:pic="http://schemas.openxmlformats.org/drawingml/2006/picture">
+            <wp:extent cx="5486400" cy="2738446"/>
+            <wp:docPr id="6" name="Picture 6"/>
+            <wp:cNvGraphicFramePr>
+              <a:graphicFrameLocks noChangeAspect="1"/>
+            </wp:cNvGraphicFramePr>
+            <a:graphic>
+              <a:graphicData uri="http://schemas.openxmlformats.org/drawingml/2006/picture">
+                <pic:pic>
+                  <pic:nvPicPr>
+                    <pic:cNvPr id="0" name="7_details_faculte.jpeg"/>
+                    <pic:cNvPicPr/>
+                  </pic:nvPicPr>
+                  <pic:blipFill>
+                    <a:blip r:embed="rId14"/>
+                    <a:stretch>
+                      <a:fillRect/>
+                    </a:stretch>
+                  </pic:blipFill>
+                  <pic:spPr>
+                    <a:xfrm>
+                      <a:off x="0" y="0"/>
+                      <a:ext cx="5486400" cy="2738446"/>
+                    </a:xfrm>
+                    <a:prstGeom prst="rect"/>
+                  </pic:spPr>
+                </pic:pic>
+              </a:graphicData>
+            </a:graphic>
+          </wp:inline>
+        </w:drawing>
       </w:r>
     </w:p>
     <w:p>
@@ -2217,6 +2433,42 @@
     <w:p>
       <w:r>
         <w:t>La page affiche toutes les equipes de l'edition en cours sous forme de tableau. Chaque ligne indique le nom de l'equipe, sa faculte d'appartenance, la discipline pratiquee et le nombre de joueurs inscrits. Une barre de recherche filtre les resultats en temps reel.</w:t>
+      </w:r>
+    </w:p>
+    <w:p>
+      <w:r>
+        <w:drawing>
+          <wp:inline xmlns:a="http://schemas.openxmlformats.org/drawingml/2006/main" xmlns:pic="http://schemas.openxmlformats.org/drawingml/2006/picture">
+            <wp:extent cx="5486400" cy="4991958"/>
+            <wp:docPr id="7" name="Picture 7"/>
+            <wp:cNvGraphicFramePr>
+              <a:graphicFrameLocks noChangeAspect="1"/>
+            </wp:cNvGraphicFramePr>
+            <a:graphic>
+              <a:graphicData uri="http://schemas.openxmlformats.org/drawingml/2006/picture">
+                <pic:pic>
+                  <pic:nvPicPr>
+                    <pic:cNvPr id="0" name="11_repertoire_equipes.jpeg"/>
+                    <pic:cNvPicPr/>
+                  </pic:nvPicPr>
+                  <pic:blipFill>
+                    <a:blip r:embed="rId15"/>
+                    <a:stretch>
+                      <a:fillRect/>
+                    </a:stretch>
+                  </pic:blipFill>
+                  <pic:spPr>
+                    <a:xfrm>
+                      <a:off x="0" y="0"/>
+                      <a:ext cx="5486400" cy="4991958"/>
+                    </a:xfrm>
+                    <a:prstGeom prst="rect"/>
+                  </pic:spPr>
+                </pic:pic>
+              </a:graphicData>
+            </a:graphic>
+          </wp:inline>
+        </w:drawing>
       </w:r>
     </w:p>
     <w:p>
@@ -2571,6 +2823,42 @@
       </w:r>
     </w:p>
     <w:p>
+      <w:r>
+        <w:drawing>
+          <wp:inline xmlns:a="http://schemas.openxmlformats.org/drawingml/2006/main" xmlns:pic="http://schemas.openxmlformats.org/drawingml/2006/picture">
+            <wp:extent cx="5486400" cy="2738446"/>
+            <wp:docPr id="8" name="Picture 8"/>
+            <wp:cNvGraphicFramePr>
+              <a:graphicFrameLocks noChangeAspect="1"/>
+            </wp:cNvGraphicFramePr>
+            <a:graphic>
+              <a:graphicData uri="http://schemas.openxmlformats.org/drawingml/2006/picture">
+                <pic:pic>
+                  <pic:nvPicPr>
+                    <pic:cNvPr id="0" name="9_ajouter_equipe.jpeg"/>
+                    <pic:cNvPicPr/>
+                  </pic:nvPicPr>
+                  <pic:blipFill>
+                    <a:blip r:embed="rId16"/>
+                    <a:stretch>
+                      <a:fillRect/>
+                    </a:stretch>
+                  </pic:blipFill>
+                  <pic:spPr>
+                    <a:xfrm>
+                      <a:off x="0" y="0"/>
+                      <a:ext cx="5486400" cy="2738446"/>
+                    </a:xfrm>
+                    <a:prstGeom prst="rect"/>
+                  </pic:spPr>
+                </pic:pic>
+              </a:graphicData>
+            </a:graphic>
+          </wp:inline>
+        </w:drawing>
+      </w:r>
+    </w:p>
+    <w:p>
       <w:pPr>
         <w:pStyle w:val="Heading2"/>
       </w:pPr>
@@ -2634,6 +2922,42 @@
     <w:p>
       <w:r>
         <w:t>La page des joueurs affiche un tableau complet de tous les sportifs inscrits pour l'edition selectionnee. Les colonnes affichees sont : Nom, Prenom, Numero de Maillot, Sexe, Equipe, Faculte, et Nombre de Buts. Un champ de recherche en haut permet de filtrer instantanement par nom ou equipe.</w:t>
+      </w:r>
+    </w:p>
+    <w:p>
+      <w:r>
+        <w:drawing>
+          <wp:inline xmlns:a="http://schemas.openxmlformats.org/drawingml/2006/main" xmlns:pic="http://schemas.openxmlformats.org/drawingml/2006/picture">
+            <wp:extent cx="5486400" cy="18795120"/>
+            <wp:docPr id="9" name="Picture 9"/>
+            <wp:cNvGraphicFramePr>
+              <a:graphicFrameLocks noChangeAspect="1"/>
+            </wp:cNvGraphicFramePr>
+            <a:graphic>
+              <a:graphicData uri="http://schemas.openxmlformats.org/drawingml/2006/picture">
+                <pic:pic>
+                  <pic:nvPicPr>
+                    <pic:cNvPr id="0" name="12_repertoire_joueurs.jpeg"/>
+                    <pic:cNvPicPr/>
+                  </pic:nvPicPr>
+                  <pic:blipFill>
+                    <a:blip r:embed="rId17"/>
+                    <a:stretch>
+                      <a:fillRect/>
+                    </a:stretch>
+                  </pic:blipFill>
+                  <pic:spPr>
+                    <a:xfrm>
+                      <a:off x="0" y="0"/>
+                      <a:ext cx="5486400" cy="18795120"/>
+                    </a:xfrm>
+                    <a:prstGeom prst="rect"/>
+                  </pic:spPr>
+                </pic:pic>
+              </a:graphicData>
+            </a:graphic>
+          </wp:inline>
+        </w:drawing>
       </w:r>
     </w:p>
     <w:p>
@@ -3036,6 +3360,42 @@
     </w:tbl>
     <w:p/>
     <w:p>
+      <w:r>
+        <w:drawing>
+          <wp:inline xmlns:a="http://schemas.openxmlformats.org/drawingml/2006/main" xmlns:pic="http://schemas.openxmlformats.org/drawingml/2006/picture">
+            <wp:extent cx="5486400" cy="2738446"/>
+            <wp:docPr id="10" name="Picture 10"/>
+            <wp:cNvGraphicFramePr>
+              <a:graphicFrameLocks noChangeAspect="1"/>
+            </wp:cNvGraphicFramePr>
+            <a:graphic>
+              <a:graphicData uri="http://schemas.openxmlformats.org/drawingml/2006/picture">
+                <pic:pic>
+                  <pic:nvPicPr>
+                    <pic:cNvPr id="0" name="10_ajouter_joueur.jpeg"/>
+                    <pic:cNvPicPr/>
+                  </pic:nvPicPr>
+                  <pic:blipFill>
+                    <a:blip r:embed="rId18"/>
+                    <a:stretch>
+                      <a:fillRect/>
+                    </a:stretch>
+                  </pic:blipFill>
+                  <pic:spPr>
+                    <a:xfrm>
+                      <a:off x="0" y="0"/>
+                      <a:ext cx="5486400" cy="2738446"/>
+                    </a:xfrm>
+                    <a:prstGeom prst="rect"/>
+                  </pic:spPr>
+                </pic:pic>
+              </a:graphicData>
+            </a:graphic>
+          </wp:inline>
+        </w:drawing>
+      </w:r>
+    </w:p>
+    <w:p>
       <w:pPr>
         <w:pStyle w:val="Heading2"/>
       </w:pPr>
@@ -3131,6 +3491,42 @@
       </w:pPr>
       <w:r>
         <w:t>Les boutons d'action : Voir, Modifier (bleu), Supprimer (rouge)</w:t>
+      </w:r>
+    </w:p>
+    <w:p>
+      <w:r>
+        <w:drawing>
+          <wp:inline xmlns:a="http://schemas.openxmlformats.org/drawingml/2006/main" xmlns:pic="http://schemas.openxmlformats.org/drawingml/2006/picture">
+            <wp:extent cx="5486400" cy="7575099"/>
+            <wp:docPr id="11" name="Picture 11"/>
+            <wp:cNvGraphicFramePr>
+              <a:graphicFrameLocks noChangeAspect="1"/>
+            </wp:cNvGraphicFramePr>
+            <a:graphic>
+              <a:graphicData uri="http://schemas.openxmlformats.org/drawingml/2006/picture">
+                <pic:pic>
+                  <pic:nvPicPr>
+                    <pic:cNvPr id="0" name="13_calendrier_rencontres.jpeg"/>
+                    <pic:cNvPicPr/>
+                  </pic:nvPicPr>
+                  <pic:blipFill>
+                    <a:blip r:embed="rId19"/>
+                    <a:stretch>
+                      <a:fillRect/>
+                    </a:stretch>
+                  </pic:blipFill>
+                  <pic:spPr>
+                    <a:xfrm>
+                      <a:off x="0" y="0"/>
+                      <a:ext cx="5486400" cy="7575099"/>
+                    </a:xfrm>
+                    <a:prstGeom prst="rect"/>
+                  </pic:spPr>
+                </pic:pic>
+              </a:graphicData>
+            </a:graphic>
+          </wp:inline>
+        </w:drawing>
       </w:r>
     </w:p>
     <w:p>
@@ -3766,6 +4162,42 @@
       </w:r>
     </w:p>
     <w:p>
+      <w:r>
+        <w:drawing>
+          <wp:inline xmlns:a="http://schemas.openxmlformats.org/drawingml/2006/main" xmlns:pic="http://schemas.openxmlformats.org/drawingml/2006/picture">
+            <wp:extent cx="5486400" cy="2738446"/>
+            <wp:docPr id="12" name="Picture 12"/>
+            <wp:cNvGraphicFramePr>
+              <a:graphicFrameLocks noChangeAspect="1"/>
+            </wp:cNvGraphicFramePr>
+            <a:graphic>
+              <a:graphicData uri="http://schemas.openxmlformats.org/drawingml/2006/picture">
+                <pic:pic>
+                  <pic:nvPicPr>
+                    <pic:cNvPr id="0" name="14_details_match.jpeg"/>
+                    <pic:cNvPicPr/>
+                  </pic:nvPicPr>
+                  <pic:blipFill>
+                    <a:blip r:embed="rId20"/>
+                    <a:stretch>
+                      <a:fillRect/>
+                    </a:stretch>
+                  </pic:blipFill>
+                  <pic:spPr>
+                    <a:xfrm>
+                      <a:off x="0" y="0"/>
+                      <a:ext cx="5486400" cy="2738446"/>
+                    </a:xfrm>
+                    <a:prstGeom prst="rect"/>
+                  </pic:spPr>
+                </pic:pic>
+              </a:graphicData>
+            </a:graphic>
+          </wp:inline>
+        </w:drawing>
+      </w:r>
+    </w:p>
+    <w:p>
       <w:pPr>
         <w:pStyle w:val="Heading1"/>
       </w:pPr>
@@ -4320,6 +4752,42 @@
       </w:r>
     </w:p>
     <w:p>
+      <w:r>
+        <w:drawing>
+          <wp:inline xmlns:a="http://schemas.openxmlformats.org/drawingml/2006/main" xmlns:pic="http://schemas.openxmlformats.org/drawingml/2006/picture">
+            <wp:extent cx="5486400" cy="4567246"/>
+            <wp:docPr id="13" name="Picture 13"/>
+            <wp:cNvGraphicFramePr>
+              <a:graphicFrameLocks noChangeAspect="1"/>
+            </wp:cNvGraphicFramePr>
+            <a:graphic>
+              <a:graphicData uri="http://schemas.openxmlformats.org/drawingml/2006/picture">
+                <pic:pic>
+                  <pic:nvPicPr>
+                    <pic:cNvPr id="0" name="15_classements_statistiques.jpeg"/>
+                    <pic:cNvPicPr/>
+                  </pic:nvPicPr>
+                  <pic:blipFill>
+                    <a:blip r:embed="rId21"/>
+                    <a:stretch>
+                      <a:fillRect/>
+                    </a:stretch>
+                  </pic:blipFill>
+                  <pic:spPr>
+                    <a:xfrm>
+                      <a:off x="0" y="0"/>
+                      <a:ext cx="5486400" cy="4567246"/>
+                    </a:xfrm>
+                    <a:prstGeom prst="rect"/>
+                  </pic:spPr>
+                </pic:pic>
+              </a:graphicData>
+            </a:graphic>
+          </wp:inline>
+        </w:drawing>
+      </w:r>
+    </w:p>
+    <w:p>
       <w:pPr>
         <w:pStyle w:val="Heading2"/>
       </w:pPr>
@@ -4391,6 +4859,42 @@
       </w:r>
     </w:p>
     <w:p>
+      <w:r>
+        <w:drawing>
+          <wp:inline xmlns:a="http://schemas.openxmlformats.org/drawingml/2006/main" xmlns:pic="http://schemas.openxmlformats.org/drawingml/2006/picture">
+            <wp:extent cx="5486400" cy="30655379"/>
+            <wp:docPr id="14" name="Picture 14"/>
+            <wp:cNvGraphicFramePr>
+              <a:graphicFrameLocks noChangeAspect="1"/>
+            </wp:cNvGraphicFramePr>
+            <a:graphic>
+              <a:graphicData uri="http://schemas.openxmlformats.org/drawingml/2006/picture">
+                <pic:pic>
+                  <pic:nvPicPr>
+                    <pic:cNvPr id="0" name="18_arbre_tournoi.jpeg"/>
+                    <pic:cNvPicPr/>
+                  </pic:nvPicPr>
+                  <pic:blipFill>
+                    <a:blip r:embed="rId22"/>
+                    <a:stretch>
+                      <a:fillRect/>
+                    </a:stretch>
+                  </pic:blipFill>
+                  <pic:spPr>
+                    <a:xfrm>
+                      <a:off x="0" y="0"/>
+                      <a:ext cx="5486400" cy="30655379"/>
+                    </a:xfrm>
+                    <a:prstGeom prst="rect"/>
+                  </pic:spPr>
+                </pic:pic>
+              </a:graphicData>
+            </a:graphic>
+          </wp:inline>
+        </w:drawing>
+      </w:r>
+    </w:p>
+    <w:p>
       <w:pPr>
         <w:pStyle w:val="Heading1"/>
       </w:pPr>
@@ -4409,6 +4913,42 @@
     <w:p>
       <w:r>
         <w:t>Accessible uniquement aux administrateurs via le menu 'Gestion Staff'. Cette page affiche un tableau de tous les comptes utilisateurs avec : nom, email, role (badge colore) et date d'inscription. Des boutons 'Modifier' et 'Supprimer' sont disponibles pour chaque compte.</w:t>
+      </w:r>
+    </w:p>
+    <w:p>
+      <w:r>
+        <w:drawing>
+          <wp:inline xmlns:a="http://schemas.openxmlformats.org/drawingml/2006/main" xmlns:pic="http://schemas.openxmlformats.org/drawingml/2006/picture">
+            <wp:extent cx="5486400" cy="2738446"/>
+            <wp:docPr id="15" name="Picture 15"/>
+            <wp:cNvGraphicFramePr>
+              <a:graphicFrameLocks noChangeAspect="1"/>
+            </wp:cNvGraphicFramePr>
+            <a:graphic>
+              <a:graphicData uri="http://schemas.openxmlformats.org/drawingml/2006/picture">
+                <pic:pic>
+                  <pic:nvPicPr>
+                    <pic:cNvPr id="0" name="16_gestion_staff.jpeg"/>
+                    <pic:cNvPicPr/>
+                  </pic:nvPicPr>
+                  <pic:blipFill>
+                    <a:blip r:embed="rId23"/>
+                    <a:stretch>
+                      <a:fillRect/>
+                    </a:stretch>
+                  </pic:blipFill>
+                  <pic:spPr>
+                    <a:xfrm>
+                      <a:off x="0" y="0"/>
+                      <a:ext cx="5486400" cy="2738446"/>
+                    </a:xfrm>
+                    <a:prstGeom prst="rect"/>
+                  </pic:spPr>
+                </pic:pic>
+              </a:graphicData>
+            </a:graphic>
+          </wp:inline>
+        </w:drawing>
       </w:r>
     </w:p>
     <w:p>
@@ -4803,24 +5343,11 @@
       </w:r>
     </w:p>
     <w:p>
-      <w:pPr>
-        <w:pStyle w:val="Heading1"/>
-      </w:pPr>
-      <w:r>
-        <w:t>Captures d'Ecran (Manuel Utilisateur)</w:t>
-      </w:r>
-    </w:p>
-    <w:p>
-      <w:r>
-        <w:t>Les images ci-dessous presentent l'interface reelle de l'application.</w:t>
-      </w:r>
-    </w:p>
-    <w:p>
       <w:r>
         <w:drawing>
           <wp:inline xmlns:a="http://schemas.openxmlformats.org/drawingml/2006/main" xmlns:pic="http://schemas.openxmlformats.org/drawingml/2006/picture">
-            <wp:extent cx="5486400" cy="7315200"/>
-            <wp:docPr id="1" name="Picture 1"/>
+            <wp:extent cx="5486400" cy="3933346"/>
+            <wp:docPr id="16" name="Picture 16"/>
             <wp:cNvGraphicFramePr>
               <a:graphicFrameLocks noChangeAspect="1"/>
             </wp:cNvGraphicFramePr>
@@ -4828,11 +5355,11 @@
               <a:graphicData uri="http://schemas.openxmlformats.org/drawingml/2006/picture">
                 <pic:pic>
                   <pic:nvPicPr>
-                    <pic:cNvPr id="0" name="WhatsApp Image 2026-05-29 at 14.04.56.jpeg"/>
+                    <pic:cNvPr id="0" name="17_profil_parametres.jpeg"/>
                     <pic:cNvPicPr/>
                   </pic:nvPicPr>
                   <pic:blipFill>
-                    <a:blip r:embed="rId9"/>
+                    <a:blip r:embed="rId24"/>
                     <a:stretch>
                       <a:fillRect/>
                     </a:stretch>
@@ -4840,7 +5367,7 @@
                   <pic:spPr>
                     <a:xfrm>
                       <a:off x="0" y="0"/>
-                      <a:ext cx="5486400" cy="7315200"/>
+                      <a:ext cx="5486400" cy="3933346"/>
                     </a:xfrm>
                     <a:prstGeom prst="rect"/>
                   </pic:spPr>
@@ -4851,303 +5378,6 @@
         </w:drawing>
       </w:r>
     </w:p>
-    <w:p/>
-    <w:p>
-      <w:r>
-        <w:drawing>
-          <wp:inline xmlns:a="http://schemas.openxmlformats.org/drawingml/2006/main" xmlns:pic="http://schemas.openxmlformats.org/drawingml/2006/picture">
-            <wp:extent cx="5486400" cy="7315200"/>
-            <wp:docPr id="2" name="Picture 2"/>
-            <wp:cNvGraphicFramePr>
-              <a:graphicFrameLocks noChangeAspect="1"/>
-            </wp:cNvGraphicFramePr>
-            <a:graphic>
-              <a:graphicData uri="http://schemas.openxmlformats.org/drawingml/2006/picture">
-                <pic:pic>
-                  <pic:nvPicPr>
-                    <pic:cNvPr id="0" name="WhatsApp Image 2026-05-29 at 14.04.57 (1).jpeg"/>
-                    <pic:cNvPicPr/>
-                  </pic:nvPicPr>
-                  <pic:blipFill>
-                    <a:blip r:embed="rId10"/>
-                    <a:stretch>
-                      <a:fillRect/>
-                    </a:stretch>
-                  </pic:blipFill>
-                  <pic:spPr>
-                    <a:xfrm>
-                      <a:off x="0" y="0"/>
-                      <a:ext cx="5486400" cy="7315200"/>
-                    </a:xfrm>
-                    <a:prstGeom prst="rect"/>
-                  </pic:spPr>
-                </pic:pic>
-              </a:graphicData>
-            </a:graphic>
-          </wp:inline>
-        </w:drawing>
-      </w:r>
-    </w:p>
-    <w:p/>
-    <w:p>
-      <w:r>
-        <w:drawing>
-          <wp:inline xmlns:a="http://schemas.openxmlformats.org/drawingml/2006/main" xmlns:pic="http://schemas.openxmlformats.org/drawingml/2006/picture">
-            <wp:extent cx="5486400" cy="7315200"/>
-            <wp:docPr id="3" name="Picture 3"/>
-            <wp:cNvGraphicFramePr>
-              <a:graphicFrameLocks noChangeAspect="1"/>
-            </wp:cNvGraphicFramePr>
-            <a:graphic>
-              <a:graphicData uri="http://schemas.openxmlformats.org/drawingml/2006/picture">
-                <pic:pic>
-                  <pic:nvPicPr>
-                    <pic:cNvPr id="0" name="WhatsApp Image 2026-05-29 at 14.04.57 (2).jpeg"/>
-                    <pic:cNvPicPr/>
-                  </pic:nvPicPr>
-                  <pic:blipFill>
-                    <a:blip r:embed="rId11"/>
-                    <a:stretch>
-                      <a:fillRect/>
-                    </a:stretch>
-                  </pic:blipFill>
-                  <pic:spPr>
-                    <a:xfrm>
-                      <a:off x="0" y="0"/>
-                      <a:ext cx="5486400" cy="7315200"/>
-                    </a:xfrm>
-                    <a:prstGeom prst="rect"/>
-                  </pic:spPr>
-                </pic:pic>
-              </a:graphicData>
-            </a:graphic>
-          </wp:inline>
-        </w:drawing>
-      </w:r>
-    </w:p>
-    <w:p/>
-    <w:p>
-      <w:r>
-        <w:drawing>
-          <wp:inline xmlns:a="http://schemas.openxmlformats.org/drawingml/2006/main" xmlns:pic="http://schemas.openxmlformats.org/drawingml/2006/picture">
-            <wp:extent cx="5486400" cy="7315200"/>
-            <wp:docPr id="4" name="Picture 4"/>
-            <wp:cNvGraphicFramePr>
-              <a:graphicFrameLocks noChangeAspect="1"/>
-            </wp:cNvGraphicFramePr>
-            <a:graphic>
-              <a:graphicData uri="http://schemas.openxmlformats.org/drawingml/2006/picture">
-                <pic:pic>
-                  <pic:nvPicPr>
-                    <pic:cNvPr id="0" name="WhatsApp Image 2026-05-29 at 14.04.57 (3).jpeg"/>
-                    <pic:cNvPicPr/>
-                  </pic:nvPicPr>
-                  <pic:blipFill>
-                    <a:blip r:embed="rId12"/>
-                    <a:stretch>
-                      <a:fillRect/>
-                    </a:stretch>
-                  </pic:blipFill>
-                  <pic:spPr>
-                    <a:xfrm>
-                      <a:off x="0" y="0"/>
-                      <a:ext cx="5486400" cy="7315200"/>
-                    </a:xfrm>
-                    <a:prstGeom prst="rect"/>
-                  </pic:spPr>
-                </pic:pic>
-              </a:graphicData>
-            </a:graphic>
-          </wp:inline>
-        </w:drawing>
-      </w:r>
-    </w:p>
-    <w:p/>
-    <w:p>
-      <w:r>
-        <w:drawing>
-          <wp:inline xmlns:a="http://schemas.openxmlformats.org/drawingml/2006/main" xmlns:pic="http://schemas.openxmlformats.org/drawingml/2006/picture">
-            <wp:extent cx="5486400" cy="7315200"/>
-            <wp:docPr id="5" name="Picture 5"/>
-            <wp:cNvGraphicFramePr>
-              <a:graphicFrameLocks noChangeAspect="1"/>
-            </wp:cNvGraphicFramePr>
-            <a:graphic>
-              <a:graphicData uri="http://schemas.openxmlformats.org/drawingml/2006/picture">
-                <pic:pic>
-                  <pic:nvPicPr>
-                    <pic:cNvPr id="0" name="WhatsApp Image 2026-05-29 at 14.04.57 (4).jpeg"/>
-                    <pic:cNvPicPr/>
-                  </pic:nvPicPr>
-                  <pic:blipFill>
-                    <a:blip r:embed="rId13"/>
-                    <a:stretch>
-                      <a:fillRect/>
-                    </a:stretch>
-                  </pic:blipFill>
-                  <pic:spPr>
-                    <a:xfrm>
-                      <a:off x="0" y="0"/>
-                      <a:ext cx="5486400" cy="7315200"/>
-                    </a:xfrm>
-                    <a:prstGeom prst="rect"/>
-                  </pic:spPr>
-                </pic:pic>
-              </a:graphicData>
-            </a:graphic>
-          </wp:inline>
-        </w:drawing>
-      </w:r>
-    </w:p>
-    <w:p/>
-    <w:p>
-      <w:r>
-        <w:drawing>
-          <wp:inline xmlns:a="http://schemas.openxmlformats.org/drawingml/2006/main" xmlns:pic="http://schemas.openxmlformats.org/drawingml/2006/picture">
-            <wp:extent cx="5486400" cy="7315200"/>
-            <wp:docPr id="6" name="Picture 6"/>
-            <wp:cNvGraphicFramePr>
-              <a:graphicFrameLocks noChangeAspect="1"/>
-            </wp:cNvGraphicFramePr>
-            <a:graphic>
-              <a:graphicData uri="http://schemas.openxmlformats.org/drawingml/2006/picture">
-                <pic:pic>
-                  <pic:nvPicPr>
-                    <pic:cNvPr id="0" name="WhatsApp Image 2026-05-29 at 14.04.57.jpeg"/>
-                    <pic:cNvPicPr/>
-                  </pic:nvPicPr>
-                  <pic:blipFill>
-                    <a:blip r:embed="rId14"/>
-                    <a:stretch>
-                      <a:fillRect/>
-                    </a:stretch>
-                  </pic:blipFill>
-                  <pic:spPr>
-                    <a:xfrm>
-                      <a:off x="0" y="0"/>
-                      <a:ext cx="5486400" cy="7315200"/>
-                    </a:xfrm>
-                    <a:prstGeom prst="rect"/>
-                  </pic:spPr>
-                </pic:pic>
-              </a:graphicData>
-            </a:graphic>
-          </wp:inline>
-        </w:drawing>
-      </w:r>
-    </w:p>
-    <w:p/>
-    <w:p>
-      <w:r>
-        <w:drawing>
-          <wp:inline xmlns:a="http://schemas.openxmlformats.org/drawingml/2006/main" xmlns:pic="http://schemas.openxmlformats.org/drawingml/2006/picture">
-            <wp:extent cx="5486400" cy="7315200"/>
-            <wp:docPr id="7" name="Picture 7"/>
-            <wp:cNvGraphicFramePr>
-              <a:graphicFrameLocks noChangeAspect="1"/>
-            </wp:cNvGraphicFramePr>
-            <a:graphic>
-              <a:graphicData uri="http://schemas.openxmlformats.org/drawingml/2006/picture">
-                <pic:pic>
-                  <pic:nvPicPr>
-                    <pic:cNvPr id="0" name="WhatsApp Image 2026-05-29 at 14.04.58 (1).jpeg"/>
-                    <pic:cNvPicPr/>
-                  </pic:nvPicPr>
-                  <pic:blipFill>
-                    <a:blip r:embed="rId15"/>
-                    <a:stretch>
-                      <a:fillRect/>
-                    </a:stretch>
-                  </pic:blipFill>
-                  <pic:spPr>
-                    <a:xfrm>
-                      <a:off x="0" y="0"/>
-                      <a:ext cx="5486400" cy="7315200"/>
-                    </a:xfrm>
-                    <a:prstGeom prst="rect"/>
-                  </pic:spPr>
-                </pic:pic>
-              </a:graphicData>
-            </a:graphic>
-          </wp:inline>
-        </w:drawing>
-      </w:r>
-    </w:p>
-    <w:p/>
-    <w:p>
-      <w:r>
-        <w:drawing>
-          <wp:inline xmlns:a="http://schemas.openxmlformats.org/drawingml/2006/main" xmlns:pic="http://schemas.openxmlformats.org/drawingml/2006/picture">
-            <wp:extent cx="5486400" cy="7315200"/>
-            <wp:docPr id="8" name="Picture 8"/>
-            <wp:cNvGraphicFramePr>
-              <a:graphicFrameLocks noChangeAspect="1"/>
-            </wp:cNvGraphicFramePr>
-            <a:graphic>
-              <a:graphicData uri="http://schemas.openxmlformats.org/drawingml/2006/picture">
-                <pic:pic>
-                  <pic:nvPicPr>
-                    <pic:cNvPr id="0" name="WhatsApp Image 2026-05-29 at 14.04.58 (2).jpeg"/>
-                    <pic:cNvPicPr/>
-                  </pic:nvPicPr>
-                  <pic:blipFill>
-                    <a:blip r:embed="rId16"/>
-                    <a:stretch>
-                      <a:fillRect/>
-                    </a:stretch>
-                  </pic:blipFill>
-                  <pic:spPr>
-                    <a:xfrm>
-                      <a:off x="0" y="0"/>
-                      <a:ext cx="5486400" cy="7315200"/>
-                    </a:xfrm>
-                    <a:prstGeom prst="rect"/>
-                  </pic:spPr>
-                </pic:pic>
-              </a:graphicData>
-            </a:graphic>
-          </wp:inline>
-        </w:drawing>
-      </w:r>
-    </w:p>
-    <w:p/>
-    <w:p>
-      <w:r>
-        <w:drawing>
-          <wp:inline xmlns:a="http://schemas.openxmlformats.org/drawingml/2006/main" xmlns:pic="http://schemas.openxmlformats.org/drawingml/2006/picture">
-            <wp:extent cx="5486400" cy="7315200"/>
-            <wp:docPr id="9" name="Picture 9"/>
-            <wp:cNvGraphicFramePr>
-              <a:graphicFrameLocks noChangeAspect="1"/>
-            </wp:cNvGraphicFramePr>
-            <a:graphic>
-              <a:graphicData uri="http://schemas.openxmlformats.org/drawingml/2006/picture">
-                <pic:pic>
-                  <pic:nvPicPr>
-                    <pic:cNvPr id="0" name="WhatsApp Image 2026-05-29 at 14.04.58.jpeg"/>
-                    <pic:cNvPicPr/>
-                  </pic:nvPicPr>
-                  <pic:blipFill>
-                    <a:blip r:embed="rId17"/>
-                    <a:stretch>
-                      <a:fillRect/>
-                    </a:stretch>
-                  </pic:blipFill>
-                  <pic:spPr>
-                    <a:xfrm>
-                      <a:off x="0" y="0"/>
-                      <a:ext cx="5486400" cy="7315200"/>
-                    </a:xfrm>
-                    <a:prstGeom prst="rect"/>
-                  </pic:spPr>
-                </pic:pic>
-              </a:graphicData>
-            </a:graphic>
-          </wp:inline>
-        </w:drawing>
-      </w:r>
-    </w:p>
-    <w:p/>
     <w:sectPr>
       <w:pgSz w:w="12240" w:h="15840"/>
       <w:pgMar w:top="1440" w:right="1800" w:bottom="1440" w:left="1800" w:header="720" w:footer="720" w:gutter="0"/>

</xml_diff>

<commit_message>
docs: ajout des specifications techniques completes (pile technologique, MVC, schema BDD, routes, securite, deploiement)
</commit_message>
<xml_diff>
--- a/docs/2_Manuel_Utilisateur.docx
+++ b/docs/2_Manuel_Utilisateur.docx
@@ -340,42 +340,6 @@
     <w:p>
       <w:r>
         <w:t>En cas d'erreur de saisie, un message d'erreur en rouge apparait sous le champ concerne.</w:t>
-      </w:r>
-    </w:p>
-    <w:p>
-      <w:r>
-        <w:drawing>
-          <wp:inline xmlns:a="http://schemas.openxmlformats.org/drawingml/2006/main" xmlns:pic="http://schemas.openxmlformats.org/drawingml/2006/picture">
-            <wp:extent cx="5486400" cy="2738446"/>
-            <wp:docPr id="1" name="Picture 1"/>
-            <wp:cNvGraphicFramePr>
-              <a:graphicFrameLocks noChangeAspect="1"/>
-            </wp:cNvGraphicFramePr>
-            <a:graphic>
-              <a:graphicData uri="http://schemas.openxmlformats.org/drawingml/2006/picture">
-                <pic:pic>
-                  <pic:nvPicPr>
-                    <pic:cNvPr id="0" name="2_login.jpeg"/>
-                    <pic:cNvPicPr/>
-                  </pic:nvPicPr>
-                  <pic:blipFill>
-                    <a:blip r:embed="rId9"/>
-                    <a:stretch>
-                      <a:fillRect/>
-                    </a:stretch>
-                  </pic:blipFill>
-                  <pic:spPr>
-                    <a:xfrm>
-                      <a:off x="0" y="0"/>
-                      <a:ext cx="5486400" cy="2738446"/>
-                    </a:xfrm>
-                    <a:prstGeom prst="rect"/>
-                  </pic:spPr>
-                </pic:pic>
-              </a:graphicData>
-            </a:graphic>
-          </wp:inline>
-        </w:drawing>
       </w:r>
     </w:p>
     <w:p>
@@ -1044,42 +1008,6 @@
       </w:r>
     </w:p>
     <w:p>
-      <w:r>
-        <w:drawing>
-          <wp:inline xmlns:a="http://schemas.openxmlformats.org/drawingml/2006/main" xmlns:pic="http://schemas.openxmlformats.org/drawingml/2006/picture">
-            <wp:extent cx="5486400" cy="11711293"/>
-            <wp:docPr id="2" name="Picture 2"/>
-            <wp:cNvGraphicFramePr>
-              <a:graphicFrameLocks noChangeAspect="1"/>
-            </wp:cNvGraphicFramePr>
-            <a:graphic>
-              <a:graphicData uri="http://schemas.openxmlformats.org/drawingml/2006/picture">
-                <pic:pic>
-                  <pic:nvPicPr>
-                    <pic:cNvPr id="0" name="4_dashboard_principal.jpeg"/>
-                    <pic:cNvPicPr/>
-                  </pic:nvPicPr>
-                  <pic:blipFill>
-                    <a:blip r:embed="rId10"/>
-                    <a:stretch>
-                      <a:fillRect/>
-                    </a:stretch>
-                  </pic:blipFill>
-                  <pic:spPr>
-                    <a:xfrm>
-                      <a:off x="0" y="0"/>
-                      <a:ext cx="5486400" cy="11711293"/>
-                    </a:xfrm>
-                    <a:prstGeom prst="rect"/>
-                  </pic:spPr>
-                </pic:pic>
-              </a:graphicData>
-            </a:graphic>
-          </wp:inline>
-        </w:drawing>
-      </w:r>
-    </w:p>
-    <w:p>
       <w:pPr>
         <w:pStyle w:val="Heading2"/>
       </w:pPr>
@@ -1434,42 +1362,6 @@
       </w:pPr>
       <w:r>
         <w:t>Terminee (badge vert) : Tous les matchs ont ete joues. L'edition est archivee.</w:t>
-      </w:r>
-    </w:p>
-    <w:p>
-      <w:r>
-        <w:drawing>
-          <wp:inline xmlns:a="http://schemas.openxmlformats.org/drawingml/2006/main" xmlns:pic="http://schemas.openxmlformats.org/drawingml/2006/picture">
-            <wp:extent cx="5486400" cy="2738446"/>
-            <wp:docPr id="3" name="Picture 3"/>
-            <wp:cNvGraphicFramePr>
-              <a:graphicFrameLocks noChangeAspect="1"/>
-            </wp:cNvGraphicFramePr>
-            <a:graphic>
-              <a:graphicData uri="http://schemas.openxmlformats.org/drawingml/2006/picture">
-                <pic:pic>
-                  <pic:nvPicPr>
-                    <pic:cNvPr id="0" name="3_selection_edition.jpeg"/>
-                    <pic:cNvPicPr/>
-                  </pic:nvPicPr>
-                  <pic:blipFill>
-                    <a:blip r:embed="rId11"/>
-                    <a:stretch>
-                      <a:fillRect/>
-                    </a:stretch>
-                  </pic:blipFill>
-                  <pic:spPr>
-                    <a:xfrm>
-                      <a:off x="0" y="0"/>
-                      <a:ext cx="5486400" cy="2738446"/>
-                    </a:xfrm>
-                    <a:prstGeom prst="rect"/>
-                  </pic:spPr>
-                </pic:pic>
-              </a:graphicData>
-            </a:graphic>
-          </wp:inline>
-        </w:drawing>
       </w:r>
     </w:p>
     <w:p>
@@ -2010,42 +1902,6 @@
       </w:r>
     </w:p>
     <w:p>
-      <w:r>
-        <w:drawing>
-          <wp:inline xmlns:a="http://schemas.openxmlformats.org/drawingml/2006/main" xmlns:pic="http://schemas.openxmlformats.org/drawingml/2006/picture">
-            <wp:extent cx="5486400" cy="3166328"/>
-            <wp:docPr id="4" name="Picture 4"/>
-            <wp:cNvGraphicFramePr>
-              <a:graphicFrameLocks noChangeAspect="1"/>
-            </wp:cNvGraphicFramePr>
-            <a:graphic>
-              <a:graphicData uri="http://schemas.openxmlformats.org/drawingml/2006/picture">
-                <pic:pic>
-                  <pic:nvPicPr>
-                    <pic:cNvPr id="0" name="5_liste_facultes.jpeg"/>
-                    <pic:cNvPicPr/>
-                  </pic:nvPicPr>
-                  <pic:blipFill>
-                    <a:blip r:embed="rId12"/>
-                    <a:stretch>
-                      <a:fillRect/>
-                    </a:stretch>
-                  </pic:blipFill>
-                  <pic:spPr>
-                    <a:xfrm>
-                      <a:off x="0" y="0"/>
-                      <a:ext cx="5486400" cy="3166328"/>
-                    </a:xfrm>
-                    <a:prstGeom prst="rect"/>
-                  </pic:spPr>
-                </pic:pic>
-              </a:graphicData>
-            </a:graphic>
-          </wp:inline>
-        </w:drawing>
-      </w:r>
-    </w:p>
-    <w:p>
       <w:pPr>
         <w:pStyle w:val="Heading2"/>
       </w:pPr>
@@ -2330,42 +2186,6 @@
     </w:tbl>
     <w:p/>
     <w:p>
-      <w:r>
-        <w:drawing>
-          <wp:inline xmlns:a="http://schemas.openxmlformats.org/drawingml/2006/main" xmlns:pic="http://schemas.openxmlformats.org/drawingml/2006/picture">
-            <wp:extent cx="5486400" cy="2738446"/>
-            <wp:docPr id="5" name="Picture 5"/>
-            <wp:cNvGraphicFramePr>
-              <a:graphicFrameLocks noChangeAspect="1"/>
-            </wp:cNvGraphicFramePr>
-            <a:graphic>
-              <a:graphicData uri="http://schemas.openxmlformats.org/drawingml/2006/picture">
-                <pic:pic>
-                  <pic:nvPicPr>
-                    <pic:cNvPr id="0" name="6_ajouter_faculte.jpeg"/>
-                    <pic:cNvPicPr/>
-                  </pic:nvPicPr>
-                  <pic:blipFill>
-                    <a:blip r:embed="rId13"/>
-                    <a:stretch>
-                      <a:fillRect/>
-                    </a:stretch>
-                  </pic:blipFill>
-                  <pic:spPr>
-                    <a:xfrm>
-                      <a:off x="0" y="0"/>
-                      <a:ext cx="5486400" cy="2738446"/>
-                    </a:xfrm>
-                    <a:prstGeom prst="rect"/>
-                  </pic:spPr>
-                </pic:pic>
-              </a:graphicData>
-            </a:graphic>
-          </wp:inline>
-        </w:drawing>
-      </w:r>
-    </w:p>
-    <w:p>
       <w:pPr>
         <w:pStyle w:val="Heading2"/>
       </w:pPr>
@@ -2376,42 +2196,6 @@
     <w:p>
       <w:r>
         <w:t>La page de detail affiche les informations de la faculte ainsi que la liste de toutes ses equipes inscrites, avec pour chaque equipe : la discipline, le nombre de joueurs et un lien vers la fiche de l'equipe.</w:t>
-      </w:r>
-    </w:p>
-    <w:p>
-      <w:r>
-        <w:drawing>
-          <wp:inline xmlns:a="http://schemas.openxmlformats.org/drawingml/2006/main" xmlns:pic="http://schemas.openxmlformats.org/drawingml/2006/picture">
-            <wp:extent cx="5486400" cy="2738446"/>
-            <wp:docPr id="6" name="Picture 6"/>
-            <wp:cNvGraphicFramePr>
-              <a:graphicFrameLocks noChangeAspect="1"/>
-            </wp:cNvGraphicFramePr>
-            <a:graphic>
-              <a:graphicData uri="http://schemas.openxmlformats.org/drawingml/2006/picture">
-                <pic:pic>
-                  <pic:nvPicPr>
-                    <pic:cNvPr id="0" name="7_details_faculte.jpeg"/>
-                    <pic:cNvPicPr/>
-                  </pic:nvPicPr>
-                  <pic:blipFill>
-                    <a:blip r:embed="rId14"/>
-                    <a:stretch>
-                      <a:fillRect/>
-                    </a:stretch>
-                  </pic:blipFill>
-                  <pic:spPr>
-                    <a:xfrm>
-                      <a:off x="0" y="0"/>
-                      <a:ext cx="5486400" cy="2738446"/>
-                    </a:xfrm>
-                    <a:prstGeom prst="rect"/>
-                  </pic:spPr>
-                </pic:pic>
-              </a:graphicData>
-            </a:graphic>
-          </wp:inline>
-        </w:drawing>
       </w:r>
     </w:p>
     <w:p>
@@ -2433,42 +2217,6 @@
     <w:p>
       <w:r>
         <w:t>La page affiche toutes les equipes de l'edition en cours sous forme de tableau. Chaque ligne indique le nom de l'equipe, sa faculte d'appartenance, la discipline pratiquee et le nombre de joueurs inscrits. Une barre de recherche filtre les resultats en temps reel.</w:t>
-      </w:r>
-    </w:p>
-    <w:p>
-      <w:r>
-        <w:drawing>
-          <wp:inline xmlns:a="http://schemas.openxmlformats.org/drawingml/2006/main" xmlns:pic="http://schemas.openxmlformats.org/drawingml/2006/picture">
-            <wp:extent cx="5486400" cy="4991958"/>
-            <wp:docPr id="7" name="Picture 7"/>
-            <wp:cNvGraphicFramePr>
-              <a:graphicFrameLocks noChangeAspect="1"/>
-            </wp:cNvGraphicFramePr>
-            <a:graphic>
-              <a:graphicData uri="http://schemas.openxmlformats.org/drawingml/2006/picture">
-                <pic:pic>
-                  <pic:nvPicPr>
-                    <pic:cNvPr id="0" name="11_repertoire_equipes.jpeg"/>
-                    <pic:cNvPicPr/>
-                  </pic:nvPicPr>
-                  <pic:blipFill>
-                    <a:blip r:embed="rId15"/>
-                    <a:stretch>
-                      <a:fillRect/>
-                    </a:stretch>
-                  </pic:blipFill>
-                  <pic:spPr>
-                    <a:xfrm>
-                      <a:off x="0" y="0"/>
-                      <a:ext cx="5486400" cy="4991958"/>
-                    </a:xfrm>
-                    <a:prstGeom prst="rect"/>
-                  </pic:spPr>
-                </pic:pic>
-              </a:graphicData>
-            </a:graphic>
-          </wp:inline>
-        </w:drawing>
       </w:r>
     </w:p>
     <w:p>
@@ -2823,42 +2571,6 @@
       </w:r>
     </w:p>
     <w:p>
-      <w:r>
-        <w:drawing>
-          <wp:inline xmlns:a="http://schemas.openxmlformats.org/drawingml/2006/main" xmlns:pic="http://schemas.openxmlformats.org/drawingml/2006/picture">
-            <wp:extent cx="5486400" cy="2738446"/>
-            <wp:docPr id="8" name="Picture 8"/>
-            <wp:cNvGraphicFramePr>
-              <a:graphicFrameLocks noChangeAspect="1"/>
-            </wp:cNvGraphicFramePr>
-            <a:graphic>
-              <a:graphicData uri="http://schemas.openxmlformats.org/drawingml/2006/picture">
-                <pic:pic>
-                  <pic:nvPicPr>
-                    <pic:cNvPr id="0" name="9_ajouter_equipe.jpeg"/>
-                    <pic:cNvPicPr/>
-                  </pic:nvPicPr>
-                  <pic:blipFill>
-                    <a:blip r:embed="rId16"/>
-                    <a:stretch>
-                      <a:fillRect/>
-                    </a:stretch>
-                  </pic:blipFill>
-                  <pic:spPr>
-                    <a:xfrm>
-                      <a:off x="0" y="0"/>
-                      <a:ext cx="5486400" cy="2738446"/>
-                    </a:xfrm>
-                    <a:prstGeom prst="rect"/>
-                  </pic:spPr>
-                </pic:pic>
-              </a:graphicData>
-            </a:graphic>
-          </wp:inline>
-        </w:drawing>
-      </w:r>
-    </w:p>
-    <w:p>
       <w:pPr>
         <w:pStyle w:val="Heading2"/>
       </w:pPr>
@@ -2922,42 +2634,6 @@
     <w:p>
       <w:r>
         <w:t>La page des joueurs affiche un tableau complet de tous les sportifs inscrits pour l'edition selectionnee. Les colonnes affichees sont : Nom, Prenom, Numero de Maillot, Sexe, Equipe, Faculte, et Nombre de Buts. Un champ de recherche en haut permet de filtrer instantanement par nom ou equipe.</w:t>
-      </w:r>
-    </w:p>
-    <w:p>
-      <w:r>
-        <w:drawing>
-          <wp:inline xmlns:a="http://schemas.openxmlformats.org/drawingml/2006/main" xmlns:pic="http://schemas.openxmlformats.org/drawingml/2006/picture">
-            <wp:extent cx="5486400" cy="18795120"/>
-            <wp:docPr id="9" name="Picture 9"/>
-            <wp:cNvGraphicFramePr>
-              <a:graphicFrameLocks noChangeAspect="1"/>
-            </wp:cNvGraphicFramePr>
-            <a:graphic>
-              <a:graphicData uri="http://schemas.openxmlformats.org/drawingml/2006/picture">
-                <pic:pic>
-                  <pic:nvPicPr>
-                    <pic:cNvPr id="0" name="12_repertoire_joueurs.jpeg"/>
-                    <pic:cNvPicPr/>
-                  </pic:nvPicPr>
-                  <pic:blipFill>
-                    <a:blip r:embed="rId17"/>
-                    <a:stretch>
-                      <a:fillRect/>
-                    </a:stretch>
-                  </pic:blipFill>
-                  <pic:spPr>
-                    <a:xfrm>
-                      <a:off x="0" y="0"/>
-                      <a:ext cx="5486400" cy="18795120"/>
-                    </a:xfrm>
-                    <a:prstGeom prst="rect"/>
-                  </pic:spPr>
-                </pic:pic>
-              </a:graphicData>
-            </a:graphic>
-          </wp:inline>
-        </w:drawing>
       </w:r>
     </w:p>
     <w:p>
@@ -3360,42 +3036,6 @@
     </w:tbl>
     <w:p/>
     <w:p>
-      <w:r>
-        <w:drawing>
-          <wp:inline xmlns:a="http://schemas.openxmlformats.org/drawingml/2006/main" xmlns:pic="http://schemas.openxmlformats.org/drawingml/2006/picture">
-            <wp:extent cx="5486400" cy="2738446"/>
-            <wp:docPr id="10" name="Picture 10"/>
-            <wp:cNvGraphicFramePr>
-              <a:graphicFrameLocks noChangeAspect="1"/>
-            </wp:cNvGraphicFramePr>
-            <a:graphic>
-              <a:graphicData uri="http://schemas.openxmlformats.org/drawingml/2006/picture">
-                <pic:pic>
-                  <pic:nvPicPr>
-                    <pic:cNvPr id="0" name="10_ajouter_joueur.jpeg"/>
-                    <pic:cNvPicPr/>
-                  </pic:nvPicPr>
-                  <pic:blipFill>
-                    <a:blip r:embed="rId18"/>
-                    <a:stretch>
-                      <a:fillRect/>
-                    </a:stretch>
-                  </pic:blipFill>
-                  <pic:spPr>
-                    <a:xfrm>
-                      <a:off x="0" y="0"/>
-                      <a:ext cx="5486400" cy="2738446"/>
-                    </a:xfrm>
-                    <a:prstGeom prst="rect"/>
-                  </pic:spPr>
-                </pic:pic>
-              </a:graphicData>
-            </a:graphic>
-          </wp:inline>
-        </w:drawing>
-      </w:r>
-    </w:p>
-    <w:p>
       <w:pPr>
         <w:pStyle w:val="Heading2"/>
       </w:pPr>
@@ -3491,42 +3131,6 @@
       </w:pPr>
       <w:r>
         <w:t>Les boutons d'action : Voir, Modifier (bleu), Supprimer (rouge)</w:t>
-      </w:r>
-    </w:p>
-    <w:p>
-      <w:r>
-        <w:drawing>
-          <wp:inline xmlns:a="http://schemas.openxmlformats.org/drawingml/2006/main" xmlns:pic="http://schemas.openxmlformats.org/drawingml/2006/picture">
-            <wp:extent cx="5486400" cy="7575099"/>
-            <wp:docPr id="11" name="Picture 11"/>
-            <wp:cNvGraphicFramePr>
-              <a:graphicFrameLocks noChangeAspect="1"/>
-            </wp:cNvGraphicFramePr>
-            <a:graphic>
-              <a:graphicData uri="http://schemas.openxmlformats.org/drawingml/2006/picture">
-                <pic:pic>
-                  <pic:nvPicPr>
-                    <pic:cNvPr id="0" name="13_calendrier_rencontres.jpeg"/>
-                    <pic:cNvPicPr/>
-                  </pic:nvPicPr>
-                  <pic:blipFill>
-                    <a:blip r:embed="rId19"/>
-                    <a:stretch>
-                      <a:fillRect/>
-                    </a:stretch>
-                  </pic:blipFill>
-                  <pic:spPr>
-                    <a:xfrm>
-                      <a:off x="0" y="0"/>
-                      <a:ext cx="5486400" cy="7575099"/>
-                    </a:xfrm>
-                    <a:prstGeom prst="rect"/>
-                  </pic:spPr>
-                </pic:pic>
-              </a:graphicData>
-            </a:graphic>
-          </wp:inline>
-        </w:drawing>
       </w:r>
     </w:p>
     <w:p>
@@ -4162,42 +3766,6 @@
       </w:r>
     </w:p>
     <w:p>
-      <w:r>
-        <w:drawing>
-          <wp:inline xmlns:a="http://schemas.openxmlformats.org/drawingml/2006/main" xmlns:pic="http://schemas.openxmlformats.org/drawingml/2006/picture">
-            <wp:extent cx="5486400" cy="2738446"/>
-            <wp:docPr id="12" name="Picture 12"/>
-            <wp:cNvGraphicFramePr>
-              <a:graphicFrameLocks noChangeAspect="1"/>
-            </wp:cNvGraphicFramePr>
-            <a:graphic>
-              <a:graphicData uri="http://schemas.openxmlformats.org/drawingml/2006/picture">
-                <pic:pic>
-                  <pic:nvPicPr>
-                    <pic:cNvPr id="0" name="14_details_match.jpeg"/>
-                    <pic:cNvPicPr/>
-                  </pic:nvPicPr>
-                  <pic:blipFill>
-                    <a:blip r:embed="rId20"/>
-                    <a:stretch>
-                      <a:fillRect/>
-                    </a:stretch>
-                  </pic:blipFill>
-                  <pic:spPr>
-                    <a:xfrm>
-                      <a:off x="0" y="0"/>
-                      <a:ext cx="5486400" cy="2738446"/>
-                    </a:xfrm>
-                    <a:prstGeom prst="rect"/>
-                  </pic:spPr>
-                </pic:pic>
-              </a:graphicData>
-            </a:graphic>
-          </wp:inline>
-        </w:drawing>
-      </w:r>
-    </w:p>
-    <w:p>
       <w:pPr>
         <w:pStyle w:val="Heading1"/>
       </w:pPr>
@@ -4752,42 +4320,6 @@
       </w:r>
     </w:p>
     <w:p>
-      <w:r>
-        <w:drawing>
-          <wp:inline xmlns:a="http://schemas.openxmlformats.org/drawingml/2006/main" xmlns:pic="http://schemas.openxmlformats.org/drawingml/2006/picture">
-            <wp:extent cx="5486400" cy="4567246"/>
-            <wp:docPr id="13" name="Picture 13"/>
-            <wp:cNvGraphicFramePr>
-              <a:graphicFrameLocks noChangeAspect="1"/>
-            </wp:cNvGraphicFramePr>
-            <a:graphic>
-              <a:graphicData uri="http://schemas.openxmlformats.org/drawingml/2006/picture">
-                <pic:pic>
-                  <pic:nvPicPr>
-                    <pic:cNvPr id="0" name="15_classements_statistiques.jpeg"/>
-                    <pic:cNvPicPr/>
-                  </pic:nvPicPr>
-                  <pic:blipFill>
-                    <a:blip r:embed="rId21"/>
-                    <a:stretch>
-                      <a:fillRect/>
-                    </a:stretch>
-                  </pic:blipFill>
-                  <pic:spPr>
-                    <a:xfrm>
-                      <a:off x="0" y="0"/>
-                      <a:ext cx="5486400" cy="4567246"/>
-                    </a:xfrm>
-                    <a:prstGeom prst="rect"/>
-                  </pic:spPr>
-                </pic:pic>
-              </a:graphicData>
-            </a:graphic>
-          </wp:inline>
-        </w:drawing>
-      </w:r>
-    </w:p>
-    <w:p>
       <w:pPr>
         <w:pStyle w:val="Heading2"/>
       </w:pPr>
@@ -4859,42 +4391,6 @@
       </w:r>
     </w:p>
     <w:p>
-      <w:r>
-        <w:drawing>
-          <wp:inline xmlns:a="http://schemas.openxmlformats.org/drawingml/2006/main" xmlns:pic="http://schemas.openxmlformats.org/drawingml/2006/picture">
-            <wp:extent cx="5486400" cy="30655379"/>
-            <wp:docPr id="14" name="Picture 14"/>
-            <wp:cNvGraphicFramePr>
-              <a:graphicFrameLocks noChangeAspect="1"/>
-            </wp:cNvGraphicFramePr>
-            <a:graphic>
-              <a:graphicData uri="http://schemas.openxmlformats.org/drawingml/2006/picture">
-                <pic:pic>
-                  <pic:nvPicPr>
-                    <pic:cNvPr id="0" name="18_arbre_tournoi.jpeg"/>
-                    <pic:cNvPicPr/>
-                  </pic:nvPicPr>
-                  <pic:blipFill>
-                    <a:blip r:embed="rId22"/>
-                    <a:stretch>
-                      <a:fillRect/>
-                    </a:stretch>
-                  </pic:blipFill>
-                  <pic:spPr>
-                    <a:xfrm>
-                      <a:off x="0" y="0"/>
-                      <a:ext cx="5486400" cy="30655379"/>
-                    </a:xfrm>
-                    <a:prstGeom prst="rect"/>
-                  </pic:spPr>
-                </pic:pic>
-              </a:graphicData>
-            </a:graphic>
-          </wp:inline>
-        </w:drawing>
-      </w:r>
-    </w:p>
-    <w:p>
       <w:pPr>
         <w:pStyle w:val="Heading1"/>
       </w:pPr>
@@ -4913,42 +4409,6 @@
     <w:p>
       <w:r>
         <w:t>Accessible uniquement aux administrateurs via le menu 'Gestion Staff'. Cette page affiche un tableau de tous les comptes utilisateurs avec : nom, email, role (badge colore) et date d'inscription. Des boutons 'Modifier' et 'Supprimer' sont disponibles pour chaque compte.</w:t>
-      </w:r>
-    </w:p>
-    <w:p>
-      <w:r>
-        <w:drawing>
-          <wp:inline xmlns:a="http://schemas.openxmlformats.org/drawingml/2006/main" xmlns:pic="http://schemas.openxmlformats.org/drawingml/2006/picture">
-            <wp:extent cx="5486400" cy="2738446"/>
-            <wp:docPr id="15" name="Picture 15"/>
-            <wp:cNvGraphicFramePr>
-              <a:graphicFrameLocks noChangeAspect="1"/>
-            </wp:cNvGraphicFramePr>
-            <a:graphic>
-              <a:graphicData uri="http://schemas.openxmlformats.org/drawingml/2006/picture">
-                <pic:pic>
-                  <pic:nvPicPr>
-                    <pic:cNvPr id="0" name="16_gestion_staff.jpeg"/>
-                    <pic:cNvPicPr/>
-                  </pic:nvPicPr>
-                  <pic:blipFill>
-                    <a:blip r:embed="rId23"/>
-                    <a:stretch>
-                      <a:fillRect/>
-                    </a:stretch>
-                  </pic:blipFill>
-                  <pic:spPr>
-                    <a:xfrm>
-                      <a:off x="0" y="0"/>
-                      <a:ext cx="5486400" cy="2738446"/>
-                    </a:xfrm>
-                    <a:prstGeom prst="rect"/>
-                  </pic:spPr>
-                </pic:pic>
-              </a:graphicData>
-            </a:graphic>
-          </wp:inline>
-        </w:drawing>
       </w:r>
     </w:p>
     <w:p>
@@ -5342,42 +4802,6 @@
         <w:t>Suppression du Compte : Action irreversible necessitant la saisie du mot de passe actuel pour confirmation.</w:t>
       </w:r>
     </w:p>
-    <w:p>
-      <w:r>
-        <w:drawing>
-          <wp:inline xmlns:a="http://schemas.openxmlformats.org/drawingml/2006/main" xmlns:pic="http://schemas.openxmlformats.org/drawingml/2006/picture">
-            <wp:extent cx="5486400" cy="3933346"/>
-            <wp:docPr id="16" name="Picture 16"/>
-            <wp:cNvGraphicFramePr>
-              <a:graphicFrameLocks noChangeAspect="1"/>
-            </wp:cNvGraphicFramePr>
-            <a:graphic>
-              <a:graphicData uri="http://schemas.openxmlformats.org/drawingml/2006/picture">
-                <pic:pic>
-                  <pic:nvPicPr>
-                    <pic:cNvPr id="0" name="17_profil_parametres.jpeg"/>
-                    <pic:cNvPicPr/>
-                  </pic:nvPicPr>
-                  <pic:blipFill>
-                    <a:blip r:embed="rId24"/>
-                    <a:stretch>
-                      <a:fillRect/>
-                    </a:stretch>
-                  </pic:blipFill>
-                  <pic:spPr>
-                    <a:xfrm>
-                      <a:off x="0" y="0"/>
-                      <a:ext cx="5486400" cy="3933346"/>
-                    </a:xfrm>
-                    <a:prstGeom prst="rect"/>
-                  </pic:spPr>
-                </pic:pic>
-              </a:graphicData>
-            </a:graphic>
-          </wp:inline>
-        </w:drawing>
-      </w:r>
-    </w:p>
     <w:sectPr>
       <w:pgSz w:w="12240" w:h="15840"/>
       <w:pgMar w:top="1440" w:right="1800" w:bottom="1440" w:left="1800" w:header="720" w:footer="720" w:gutter="0"/>

</xml_diff>